<commit_message>
hub: UST-16 FIRMADA (D1-D7 propuesta, D8 alternativa) + principio de paridad · SIGNED docx/pdf/sha256 + doc 51
</commit_message>
<xml_diff>
--- a/_integration/docs/ust/UST-2026-09-08-16-app-o3-health-connect-android.docx
+++ b/_integration/docs/ust/UST-2026-09-08-16-app-o3-health-connect-android.docx
@@ -129,6 +129,38 @@
     </w:p>
     <w:p>
       <w:pPr>
+        <w:spacing w:after="120" w:before="120"/>
+      </w:pPr>
+      <w:r>
+        <w:rPr>
+          <w:rFonts w:ascii="Aptos" w:cs="Aptos" w:eastAsia="Aptos" w:hAnsi="Aptos"/>
+          <w:b/>
+          <w:bCs/>
+          <w:color w:val="1A1818"/>
+          <w:sz w:val="20"/>
+          <w:szCs w:val="20"/>
+        </w:rPr>
+        <w:t xml:space="preserve">Principio de paridad (instrucción de Juanjo en el mismo acto de decidir):</w:t>
+      </w:r>
+    </w:p>
+    <w:p>
+      <w:pPr>
+        <w:spacing w:after="120" w:before="0"/>
+      </w:pPr>
+      <w:r>
+        <w:rPr>
+          <w:rFonts w:ascii="Aptos" w:cs="Aptos" w:eastAsia="Aptos" w:hAnsi="Aptos"/>
+          <w:i/>
+          <w:iCs/>
+          <w:color w:val="1A1818"/>
+          <w:sz w:val="20"/>
+          <w:szCs w:val="20"/>
+        </w:rPr>
+        <w:t xml:space="preserve">«Y sobre todo, las decisiones que se tomaron para iPhone valen para Android, tenemos que estar 100% seguros que siempre hay paridad en la implementacion de ambas aplicaciones, no podemos hacer desarrollos dobles, tomas de decisiones dobles, etc.» · «las aplicaciones tienen que ir parejas en funcionalidades y diseño, siempre a la vez, es ReactNative, un desarrollo dos superficies» (Juanjo, 8-sep, al decidir D1–D8). Se recoge como PRINCIPIO de esta UST y de las siguientes, con tres consecuencias operativas: (1) toda decisión firmada vale para las DOS plataformas salvo que una la haga imposible — las de UST-06 (consentimiento señal a señal, las 8 señales, write-back opcional), UST-09 (modo edición) y UST-14 (Body Insights desde Salud) se aplican a Android tal cual, sin volver a preguntar; (2) una sola implementación: la diferencia de plataforma vive en funciones PURAS (lib/plataforma.ts) y en ficheros .native, nunca en pantallas duplicadas; (3) funcionalidad Y DISEÑO viajan juntos y A LA VEZ: una entrega no está terminada hasta que las dos superficies la tienen y las dos están verificadas — nunca se publica una plataforma y se deja la otra para después; (4) lo que no se puede igualar se DECLARA con motivo y fecha de caducidad, y un guardarraíl lo vigila (C10). Es React Native: un desarrollo, dos superficies — la diferencia es la excepción declarada, no el punto de partida.</w:t>
+      </w:r>
+    </w:p>
+    <w:p>
+      <w:pPr>
         <w:pStyle w:val="Heading1"/>
         <w:spacing w:after="160" w:before="320"/>
       </w:pPr>
@@ -2707,6 +2739,92 @@
                 <w:sz w:val="16"/>
                 <w:szCs w:val="16"/>
               </w:rPr>
+              <w:t xml:space="preserve">C10 · Guardarraíl de paridad (nace de la instrucción de Juanjo)</w:t>
+            </w:r>
+          </w:p>
+        </w:tc>
+        <w:tc>
+          <w:tcPr>
+            <w:tcW w:type="dxa" w:w="5356"/>
+            <w:tcMar>
+              <w:top w:type="dxa" w:w="70"/>
+              <w:left w:type="dxa" w:w="100"/>
+              <w:bottom w:type="dxa" w:w="70"/>
+              <w:right w:type="dxa" w:w="100"/>
+            </w:tcMar>
+          </w:tcPr>
+          <w:p>
+            <w:pPr>
+              <w:spacing w:after="40"/>
+            </w:pPr>
+            <w:r>
+              <w:rPr>
+                <w:rFonts w:ascii="Aptos" w:cs="Aptos" w:eastAsia="Aptos" w:hAnsi="Aptos"/>
+                <w:b w:val="false"/>
+                <w:bCs w:val="false"/>
+                <w:color w:val="6B6B6B"/>
+                <w:sz w:val="16"/>
+                <w:szCs w:val="16"/>
+              </w:rPr>
+              <w:t xml:space="preserve">Un test que IMPIDE la deriva entre plataformas: recorre src/screens y src/ui buscando toda condición de plataforma (Platform.OS === "ios" | "android", Platform.select con ramas de UI) y falla si no está declarada en un registro con motivo, tipo (permanente | temporal) y, si es temporal, hasta cuándo. Hoy quedarían declaradas: los insets de barra (permanente, D1 de UST-15), la marca de la biometría (permanente, D5), el comportamiento del teclado (permanente, del sistema) — y como TEMPORALES las que O3 elimina en esta misma UST. Cuando O3 entre, esas temporales tienen que desaparecer o el test se pone rojo. Y la segunda mitad de la paridad: el test comprueba también que ninguna PANTALLA (ruta del navegador) exista solo en una plataforma. Misma familia que los centinelas del semáforo web: la convención deja de ser una intención y pasa a tener test (r17-c).</w:t>
+            </w:r>
+          </w:p>
+        </w:tc>
+        <w:tc>
+          <w:tcPr>
+            <w:tcW w:type="dxa" w:w="2884"/>
+            <w:tcMar>
+              <w:top w:type="dxa" w:w="70"/>
+              <w:left w:type="dxa" w:w="100"/>
+              <w:bottom w:type="dxa" w:w="70"/>
+              <w:right w:type="dxa" w:w="100"/>
+            </w:tcMar>
+          </w:tcPr>
+          <w:p>
+            <w:pPr>
+              <w:spacing w:after="40"/>
+            </w:pPr>
+            <w:r>
+              <w:rPr>
+                <w:rFonts w:ascii="Aptos" w:cs="Aptos" w:eastAsia="Aptos" w:hAnsi="Aptos"/>
+                <w:b w:val="false"/>
+                <w:bCs w:val="false"/>
+                <w:color w:val="6B6B6B"/>
+                <w:sz w:val="16"/>
+                <w:szCs w:val="16"/>
+              </w:rPr>
+              <w:t xml:space="preserve">jest: se prueba EN ROJO (añadiendo un gate sin declarar) y en verde (declarándolo), como todo detector nuestro (r17-h). Al cerrar O3, las entradas temporales quedan a cero.</w:t>
+            </w:r>
+          </w:p>
+        </w:tc>
+      </w:tr>
+      <w:tr>
+        <w:trPr>
+          <w:cantSplit/>
+        </w:trPr>
+        <w:tc>
+          <w:tcPr>
+            <w:tcW w:type="dxa" w:w="2060"/>
+            <w:tcMar>
+              <w:top w:type="dxa" w:w="70"/>
+              <w:left w:type="dxa" w:w="100"/>
+              <w:bottom w:type="dxa" w:w="70"/>
+              <w:right w:type="dxa" w:w="100"/>
+            </w:tcMar>
+          </w:tcPr>
+          <w:p>
+            <w:pPr>
+              <w:spacing w:after="40"/>
+            </w:pPr>
+            <w:r>
+              <w:rPr>
+                <w:rFonts w:ascii="Aptos" w:cs="Aptos" w:eastAsia="Aptos" w:hAnsi="Aptos"/>
+                <w:b/>
+                <w:bCs/>
+                <w:color w:val="6B6B6B"/>
+                <w:sz w:val="16"/>
+                <w:szCs w:val="16"/>
+              </w:rPr>
               <w:t xml:space="preserve">Lo que NO cambia</w:t>
             </w:r>
           </w:p>
@@ -3317,6 +3435,92 @@
                 <w:szCs w:val="16"/>
               </w:rPr>
               <w:t xml:space="preserve">El resto de los catálogos.</w:t>
+            </w:r>
+          </w:p>
+        </w:tc>
+      </w:tr>
+      <w:tr>
+        <w:trPr>
+          <w:cantSplit/>
+        </w:trPr>
+        <w:tc>
+          <w:tcPr>
+            <w:tcW w:type="dxa" w:w="1854"/>
+            <w:tcMar>
+              <w:top w:type="dxa" w:w="70"/>
+              <w:left w:type="dxa" w:w="100"/>
+              <w:bottom w:type="dxa" w:w="70"/>
+              <w:right w:type="dxa" w:w="100"/>
+            </w:tcMar>
+          </w:tcPr>
+          <w:p>
+            <w:pPr>
+              <w:spacing w:after="40"/>
+            </w:pPr>
+            <w:r>
+              <w:rPr>
+                <w:rFonts w:ascii="Aptos" w:cs="Aptos" w:eastAsia="Aptos" w:hAnsi="Aptos"/>
+                <w:b/>
+                <w:bCs/>
+                <w:color w:val="6B6B6B"/>
+                <w:sz w:val="16"/>
+                <w:szCs w:val="16"/>
+              </w:rPr>
+              <w:t xml:space="preserve">repos/appdev · guardarraíl (C10)</w:t>
+            </w:r>
+          </w:p>
+        </w:tc>
+        <w:tc>
+          <w:tcPr>
+            <w:tcW w:type="dxa" w:w="5562"/>
+            <w:tcMar>
+              <w:top w:type="dxa" w:w="70"/>
+              <w:left w:type="dxa" w:w="100"/>
+              <w:bottom w:type="dxa" w:w="70"/>
+              <w:right w:type="dxa" w:w="100"/>
+            </w:tcMar>
+          </w:tcPr>
+          <w:p>
+            <w:pPr>
+              <w:spacing w:after="40"/>
+            </w:pPr>
+            <w:r>
+              <w:rPr>
+                <w:rFonts w:ascii="Aptos" w:cs="Aptos" w:eastAsia="Aptos" w:hAnsi="Aptos"/>
+                <w:b w:val="false"/>
+                <w:bCs w:val="false"/>
+                <w:color w:val="6B6B6B"/>
+                <w:sz w:val="16"/>
+                <w:szCs w:val="16"/>
+              </w:rPr>
+              <w:t xml:space="preserve">src/lib/__tests__/paridad.test.ts (nuevo) + el registro de excepciones declaradas (motivo, tipo, hasta). Sin dependencias nuevas: lee los ficheros del propio repo, como sql-columnas lee backend-sql.</w:t>
+            </w:r>
+          </w:p>
+        </w:tc>
+        <w:tc>
+          <w:tcPr>
+            <w:tcW w:type="dxa" w:w="2884"/>
+            <w:tcMar>
+              <w:top w:type="dxa" w:w="70"/>
+              <w:left w:type="dxa" w:w="100"/>
+              <w:bottom w:type="dxa" w:w="70"/>
+              <w:right w:type="dxa" w:w="100"/>
+            </w:tcMar>
+          </w:tcPr>
+          <w:p>
+            <w:pPr>
+              <w:spacing w:after="40"/>
+            </w:pPr>
+            <w:r>
+              <w:rPr>
+                <w:rFonts w:ascii="Aptos" w:cs="Aptos" w:eastAsia="Aptos" w:hAnsi="Aptos"/>
+                <w:b w:val="false"/>
+                <w:bCs w:val="false"/>
+                <w:color w:val="6B6B6B"/>
+                <w:sz w:val="16"/>
+                <w:szCs w:val="16"/>
+              </w:rPr>
+              <w:t xml:space="preserve">No cambia una sola línea de producto: es un test.</w:t>
             </w:r>
           </w:p>
         </w:tc>
@@ -5479,7 +5683,7 @@
                 <w:sz w:val="16"/>
                 <w:szCs w:val="16"/>
               </w:rPr>
-              <w:t xml:space="preserve">hcMapping + proveedor (puros, con unitarios) → healthconnect.native.ts → sync de dos proveedores → pantallas (consent, Movimiento, Dispositivos, invitación) → ruta de justificación → catálogos ×14. ≈1 día. Un commit en appdev.</w:t>
+              <w:t xml:space="preserve">hcMapping + proveedor (puros, con unitarios) → healthconnect.native.ts → sync de dos proveedores → pantallas (consent, Movimiento, Dispositivos, invitación) → ruta de justificación → catálogos ×14 → guardarraíl de paridad C10 (probado en rojo y en verde). ≈1 día. Un commit en appdev.</w:t>
             </w:r>
           </w:p>
         </w:tc>
@@ -5715,7 +5919,7 @@
                 <w:sz w:val="16"/>
                 <w:szCs w:val="16"/>
               </w:rPr>
-              <w:t xml:space="preserve">UST-16 en documentation/ust + doc 51 + tablero (release 0.23.7 con items C1–C9) + Notion cuando el workspace vuelva a escribir (hoy sin bloques).</w:t>
+              <w:t xml:space="preserve">UST-16 en documentation/ust + doc 51 + tablero (release 0.23.7 con items C1–C10) + Notion cuando el workspace vuelva a escribir (hoy sin bloques).</w:t>
             </w:r>
           </w:p>
         </w:tc>

</xml_diff>